<commit_message>
Galascope APG: confirm Linyang 25/50/20/5, flag margin visibility
Correct Linyang sales-contract payment split to final 25/50/20/5 of CIF
value across the APG structure docs and payment map. APG amount = 100% of
the 25% advance (25% of confidential Linyang CIF price), below the earlier
30% / EUR 846,951 figure. Switch the BoC Galascope-beneficiary specimen to
a placeholder amount and add a margin-visibility flag: naming Galascope as
beneficiary exposes the OEM cost and Lighthief margin (decision pending).

Co-authored-by: Cursor <cursoragent@cursor.com>
</commit_message>
<xml_diff>
--- a/docs/clients/group-order/Group2_Esperia_Energy/contracts/BoC-APG-Galascope-beneficiary-SPECIMEN-jun2026.docx
+++ b/docs/clients/group-order/Group2_Esperia_Energy/contracts/BoC-APG-Galascope-beneficiary-SPECIMEN-jun2026.docx
@@ -140,7 +140,7 @@
           <w:i w:val="0"/>
           <w:sz w:val="21"/>
         </w:rPr>
-        <w:t>(2)  We irrevocably guarantee to pay you, on first written demand, any sum up to a maximum aggregate amount of EUR 846,951 (say: [●] only) (the “Guaranteed Amount”), being one hundred percent (100%) of the advance payment made in respect of the equipment (Component A) under the Sales Contract.</w:t>
+        <w:t>(2)  We irrevocably guarantee to pay you, on first written demand, any sum up to a maximum aggregate amount of EUR [●]  (25% advance under the Sales Contract) (say: [●] only) (the “Guaranteed Amount”), being one hundred percent (100%) of the advance payment made in respect of the equipment under the Sales Contract.</w:t>
       </w:r>
     </w:p>
     <w:p>
@@ -152,7 +152,19 @@
           <w:color w:val="404040"/>
           <w:sz w:val="21"/>
         </w:rPr>
-        <w:t>Note: Guaranteed Amount = EUR 846,951 (advance on Component A / equipment only). EPC services (Component B) are outside this guarantee — the Beneficiary has accepted this.</w:t>
+        <w:t>Note: Guaranteed Amount = 100% of the 25% advance under the Sales Contract (final split 25/50/20/5). EPC services are outside this guarantee — the Beneficiary has accepted this.  amount to be inserted on confirmation.</w:t>
+      </w:r>
+    </w:p>
+    <w:p>
+      <w:r>
+        <w:rPr>
+          <w:rFonts w:ascii="Calibri" w:hAnsi="Calibri"/>
+          <w:b w:val="0"/>
+          <w:i/>
+          <w:color w:val="404040"/>
+          <w:sz w:val="21"/>
+        </w:rPr>
+        <w:t>Note: MARGIN FLAG (internal — remove before sending): the advance amount equals 25% of the Linyang CIF supply price. If the Beneficiary (Galascope) is named on the instrument, this figure reveals the OEM equipment cost and therefore Lighthief's margin. Resolve the beneficiary decision before issuing the amount.</w:t>
       </w:r>
     </w:p>
     <w:p>

</xml_diff>